<commit_message>
Revisa NT do requisito de ressarcimento (v2) e adiciona relatório de auditoria jurídica
Corrige ultratividade da Lei 8.666, alcance da PN 54/2023, referência ao
RMS 33.526 e natureza do confisco; expõe as duas interpretações do §1º do
art. 2º; distingue prejuízo apontado e exigível (art. 13 da Lei 12.846);
inclui quadro de conferência normativa, diligência ao MPF e vista ao
interessado. Conclusão (Alternativa C) mantida.

Co-Authored-By: Claude Opus 5.5 <noreply@anthropic.com>
Claude-Session: https://claude.ai/code/session_01FeoqTFRB1bKJcz5LGDxsk2
</commit_message>
<xml_diff>
--- a/DECAL/Nota_tecnica/NT_DECAL_Ressarcimento_art2_II_Portaria_1214.docx
+++ b/DECAL/Nota_tecnica/NT_DECAL_Ressarcimento_art2_II_Portaria_1214.docx
@@ -92,6 +92,70 @@
       <w:r>
         <w:t xml:space="preserve">minuta técnica para revisão institucional. Não substitui a manifestação da unidade competente nem o parecer da Consultoria Jurídica (art. 6º da Portaria CGU nº 1.214/2020).</w:t>
       </w:r>
+      <w:r>
+        <w:t xml:space="preserve"> </w:t>
+      </w:r>
+      <w:r>
+        <w:rPr>
+          <w:bCs/>
+          <w:b/>
+        </w:rPr>
+        <w:t xml:space="preserve">Versão:</w:t>
+      </w:r>
+      <w:r>
+        <w:t xml:space="preserve"> </w:t>
+      </w:r>
+      <w:r>
+        <w:t xml:space="preserve">2 — revisada após auditoria jurídica independente (relatório em</w:t>
+      </w:r>
+      <w:r>
+        <w:t xml:space="preserve"> </w:t>
+      </w:r>
+      <w:r>
+        <w:rPr>
+          <w:rStyle w:val="VerbatimChar"/>
+        </w:rPr>
+        <w:t xml:space="preserve">Revisao_NT_DECAL_art2_II.md</w:t>
+      </w:r>
+      <w:r>
+        <w:t xml:space="preserve">). Alterações principais: quadro de conferência normativa (VI-A); contraste das duas interpretações sobre o § 1º do art. 2º (6.3); distinção entre</w:t>
+      </w:r>
+      <w:r>
+        <w:t xml:space="preserve"> </w:t>
+      </w:r>
+      <w:r>
+        <w:t xml:space="preserve">“</w:t>
+      </w:r>
+      <w:r>
+        <w:t xml:space="preserve">prejuízo apontado</w:t>
+      </w:r>
+      <w:r>
+        <w:t xml:space="preserve">”</w:t>
+      </w:r>
+      <w:r>
+        <w:t xml:space="preserve"> </w:t>
+      </w:r>
+      <w:r>
+        <w:t xml:space="preserve">e</w:t>
+      </w:r>
+      <w:r>
+        <w:t xml:space="preserve"> </w:t>
+      </w:r>
+      <w:r>
+        <w:t xml:space="preserve">“</w:t>
+      </w:r>
+      <w:r>
+        <w:t xml:space="preserve">prejuízo exigível</w:t>
+      </w:r>
+      <w:r>
+        <w:t xml:space="preserve">”</w:t>
+      </w:r>
+      <w:r>
+        <w:t xml:space="preserve"> </w:t>
+      </w:r>
+      <w:r>
+        <w:t xml:space="preserve">(5.2-A e 9.4); reformulação dos cenários (11.4); natureza do confisco (8.6); diligências D3-A (MPF) e D8 (vista ao interessado); correção da referência ao RMS 33.526.</w:t>
+      </w:r>
     </w:p>
     <w:p>
       <w:pPr>
@@ -600,13 +664,19 @@
         <w:t xml:space="preserve"> </w:t>
       </w:r>
       <w:r>
-        <w:t xml:space="preserve">- (b) circularizar Petrobras, AGU, TCU, SFC/CGU e o juízo criminal;</w:t>
-      </w:r>
-      <w:r>
-        <w:t xml:space="preserve"> </w:t>
-      </w:r>
-      <w:r>
-        <w:t xml:space="preserve">- (c) solicitar complementação documental à DECAL (art. 4º, § 1º).</w:t>
+        <w:t xml:space="preserve">- (b) circularizar Petrobras, AGU, MPF, TCU, SFC/CGU e o juízo criminal;</w:t>
+      </w:r>
+      <w:r>
+        <w:t xml:space="preserve"> </w:t>
+      </w:r>
+      <w:r>
+        <w:t xml:space="preserve">- (c) solicitar complementação documental à DECAL (art. 4º, § 1º);</w:t>
+      </w:r>
+      <w:r>
+        <w:t xml:space="preserve"> </w:t>
+      </w:r>
+      <w:r>
+        <w:t xml:space="preserve">- (d) dar vista à DECAL dos elementos novos antes da conclusão (art. 44 da Lei nº 9.784/1999).</w:t>
       </w:r>
     </w:p>
     <w:p>
@@ -620,20 +690,19 @@
         <w:t xml:space="preserve"> </w:t>
       </w:r>
       <w:r>
-        <w:t xml:space="preserve">- Se as respostas não revelarem prejuízo apontado em decisão definitiva e ainda exigível, o requisito deverá ser considerado atendido, por inexistir prejuízo a ressarcir, na linha da NT nº 676/2026/SIPRI e com as mesmas ressalvas de não quitação.</w:t>
-      </w:r>
-      <w:r>
-        <w:t xml:space="preserve"> </w:t>
-      </w:r>
-      <w:r>
-        <w:t xml:space="preserve">- Se a Decisão nº 9 tiver adotado formalmente o dano de USD 868.450,00 como prejuízo apontado, a CONJUR deverá se manifestar sobre sua subsistência diante do acórdão do TRF4. Mantido o apontamento, o requisito não estará atendido enquanto não houver pagamento, descontado o que se comprovar já recuperado pela Petrobras.</w:t>
-      </w:r>
-    </w:p>
-    <w:p>
-      <w:r>
-        <w:pict>
-          <v:rect style="width:0;height:1.5pt" o:hralign="center" o:hrstd="t" o:hr="t"/>
-        </w:pict>
+        <w:t xml:space="preserve">- Se as respostas não revelarem prejuízo identificado e quantificado em decisão definitiva, com nexo causal, o requisito deverá ser considerado atendido (ou superado), por inexistir prejuízo exigível a ressarcir, na linha da NT nº 676/2026/SIPRI e com as mesmas ressalvas de não quitação.</w:t>
+      </w:r>
+      <w:r>
+        <w:t xml:space="preserve"> </w:t>
+      </w:r>
+      <w:r>
+        <w:t xml:space="preserve">- Se a Decisão nº 9 tiver adotado o dano de USD 868.450,00, a CONJUR deverá responder a duas questões: (i) se esse apontamento, feito em PAR sancionador, constitui prejuízo definitivamente quantificado e com nexo causal, considerando o art. 13 da Lei nº 12.846/2013; (ii) se ele subsiste diante do acórdão do TRF4. Só com resposta afirmativa a ambas o requisito não estará atendido até o pagamento. O eventual abatimento do confisco penal depende de juízo jurídico próprio.</w:t>
+      </w:r>
+      <w:r>
+        <w:t xml:space="preserve"> </w:t>
+      </w:r>
+      <w:r>
+        <w:t xml:space="preserve">—</w:t>
       </w:r>
     </w:p>
     <w:bookmarkEnd w:id="22"/>
@@ -3204,13 +3273,13 @@
         <w:t xml:space="preserve"> </w:t>
       </w:r>
       <w:r>
-        <w:t xml:space="preserve">2.3. Lei nº 12.846, de 1º de agosto de 2013, art. 6º, I, II e § 3º; art. 13; art. 16, § 3º; art. 21, parágrafo único.</w:t>
-      </w:r>
-      <w:r>
-        <w:t xml:space="preserve"> </w:t>
-      </w:r>
-      <w:r>
-        <w:t xml:space="preserve">2.4. Lei nº 9.784, de 29 de janeiro de 1999, art. 2º, parágrafo único, VIII e XIII; arts. 29, 36, 37, 38, 50 (inclusive inciso VII) e 53.</w:t>
+        <w:t xml:space="preserve">2.3. Lei nº 12.846, de 1º de agosto de 2013, art. 6º, I, II e § 3º; art. 13; art. 16, § 3º; arts. 19 e 21, parágrafo único.</w:t>
+      </w:r>
+      <w:r>
+        <w:t xml:space="preserve"> </w:t>
+      </w:r>
+      <w:r>
+        <w:t xml:space="preserve">2.4. Lei nº 9.784, de 29 de janeiro de 1999, art. 2º, caput e parágrafo único, VIII e XIII; arts. 3º, III, 29, 36, 37, 38, 44, 49, 50 (inclusive inciso VII) e 53.</w:t>
       </w:r>
       <w:r>
         <w:t xml:space="preserve"> </w:t>
@@ -3255,7 +3324,7 @@
         <w:t xml:space="preserve"> </w:t>
       </w:r>
       <w:r>
-        <w:t xml:space="preserve">2.9. Portaria Normativa CGU nº 54, de 14 de fevereiro de 2023 (alterações parciais da Portaria nº 1.214/2020, transcritas em D15).</w:t>
+        <w:t xml:space="preserve">2.9. Portaria Normativa CGU nº 54, de 14 de fevereiro de 2023 (alterações parciais da Portaria nº 1.214/2020; arts. 3º a 6º transcritos em D15; demais alterações conhecidas apenas por fonte secundária — Seção VI-A).</w:t>
       </w:r>
       <w:r>
         <w:t xml:space="preserve"> </w:t>
@@ -3342,6 +3411,12 @@
       </w:r>
       <w:r>
         <w:t xml:space="preserve">2.20. Nota Técnica nº 676/2026/SIPRI (SEI 3980745), Processo nº 00190.110692/2025-70 [D15], como precedente administrativo.</w:t>
+      </w:r>
+      <w:r>
+        <w:t xml:space="preserve"> </w:t>
+      </w:r>
+      <w:r>
+        <w:t xml:space="preserve">2.21. STF, AgR no RMS nº 33.526/DF, 2ª Turma, Rel. Min. Gilmar Mendes, sessão virtual de 22 a 28/09/2017, DJe de 09/10/2017 (inteiro teor não conferido; ver Anexo C).</w:t>
       </w:r>
     </w:p>
     <w:bookmarkEnd w:id="26"/>
@@ -3821,7 +3896,49 @@
         <w:t xml:space="preserve">”</w:t>
       </w:r>
       <w:r>
-        <w:t xml:space="preserve">) [D8]. A divergência parcial do Des. Victor Laus restringiu-se à lavagem de dinheiro e não alcançou a reparação [D8, voto-vista, item 3.3].</w:t>
+        <w:t xml:space="preserve">) [D8].</w:t>
+      </w:r>
+      <w:r>
+        <w:t xml:space="preserve"> </w:t>
+      </w:r>
+      <w:r>
+        <w:t xml:space="preserve">- O Revisor acompanhou o Relator</w:t>
+      </w:r>
+      <w:r>
+        <w:t xml:space="preserve"> </w:t>
+      </w:r>
+      <w:r>
+        <w:t xml:space="preserve">“</w:t>
+      </w:r>
+      <w:r>
+        <w:t xml:space="preserve">inclusive no que toca à reparação de danos</w:t>
+      </w:r>
+      <w:r>
+        <w:t xml:space="preserve">”</w:t>
+      </w:r>
+      <w:r>
+        <w:t xml:space="preserve"> </w:t>
+      </w:r>
+      <w:r>
+        <w:t xml:space="preserve">[D8, voto do Des. Leandro Paulsen, item 7]. O voto-vista do Des. Victor Laus, parcialmente vencido, divergiu quanto à lavagem de dinheiro e à extensão do provimento dos apelos. Não contém manifestação sobre a reparação de danos [D8, voto-vista, itens 3.3 a 5].</w:t>
+      </w:r>
+      <w:r>
+        <w:t xml:space="preserve"> </w:t>
+      </w:r>
+      <w:r>
+        <w:t xml:space="preserve">- A Petrobras figurou como apelante, no polo ativo (</w:t>
+      </w:r>
+      <w:r>
+        <w:t xml:space="preserve">“</w:t>
+      </w:r>
+      <w:r>
+        <w:t xml:space="preserve">AUTOR</w:t>
+      </w:r>
+      <w:r>
+        <w:t xml:space="preserve">”</w:t>
+      </w:r>
+      <w:r>
+        <w:t xml:space="preserve">), e ratificou as razões do MPF, que versavam sobre a dosimetria [D8, cabeçalho e relatório]. Não consta que tenha impugnado especificamente o afastamento da indenização mínima. Sua condição de assistente de acusação é inferida, não documentada [INFERÊNCIA].</w:t>
       </w:r>
       <w:r>
         <w:t xml:space="preserve"> </w:t>
@@ -3851,13 +3968,13 @@
         <w:t xml:space="preserve"> </w:t>
       </w:r>
       <w:r>
-        <w:t xml:space="preserve">- O PAR nº 00190.105349/2020-07 foi instaurado em 2020 [D9; D13].</w:t>
-      </w:r>
-      <w:r>
-        <w:t xml:space="preserve"> </w:t>
-      </w:r>
-      <w:r>
-        <w:t xml:space="preserve">- Pela Decisão nº 9, assinada em 09/02/2023 e publicada em 10/02/2023, o Ministro de Estado da CGU adotou</w:t>
+        <w:t xml:space="preserve">- O PAR nº 00190.105349/2020-07 foi instaurado em 2020 [D9; D13]. Segundo a narrativa da DECAL reproduzida no acórdão do TRF5, o procedimento teria sido deflagrado pela Petrobras e avocado pela CGU no mesmo ano [D9] [ALEGAÇÃO]. A narrativa invoca o art. 41 do Decreto nº 11.129/2022, norma posterior aos fatos que relata. Se confirmada a instauração originária pela Petrobras, os autos do procedimento na estatal podem conter apuração de dano (D2).</w:t>
+      </w:r>
+      <w:r>
+        <w:t xml:space="preserve"> </w:t>
+      </w:r>
+      <w:r>
+        <w:t xml:space="preserve">- Pela Decisão nº 9, assinada em 09/02/2023 [D2] e publicada em 10/02/2023 [D11, § 1 — dado da requerente, não conferido no DOU], o Ministro de Estado da CGU adotou</w:t>
       </w:r>
       <w:r>
         <w:t xml:space="preserve"> </w:t>
@@ -4311,6 +4428,155 @@
         <w:pStyle w:val="BodyText"/>
       </w:pPr>
       <w:r>
+        <w:t xml:space="preserve">5.2-A.</w:t>
+      </w:r>
+      <w:r>
+        <w:t xml:space="preserve"> </w:t>
+      </w:r>
+      <w:r>
+        <w:rPr>
+          <w:bCs/>
+          <w:b/>
+        </w:rPr>
+        <w:t xml:space="preserve">Prejuízo</w:t>
+      </w:r>
+      <w:r>
+        <w:rPr>
+          <w:bCs/>
+          <w:b/>
+        </w:rPr>
+        <w:t xml:space="preserve"> </w:t>
+      </w:r>
+      <w:r>
+        <w:rPr>
+          <w:bCs/>
+          <w:b/>
+        </w:rPr>
+        <w:t xml:space="preserve">“</w:t>
+      </w:r>
+      <w:r>
+        <w:rPr>
+          <w:bCs/>
+          <w:b/>
+        </w:rPr>
+        <w:t xml:space="preserve">apontado</w:t>
+      </w:r>
+      <w:r>
+        <w:rPr>
+          <w:bCs/>
+          <w:b/>
+        </w:rPr>
+        <w:t xml:space="preserve">”</w:t>
+      </w:r>
+      <w:r>
+        <w:rPr>
+          <w:bCs/>
+          <w:b/>
+        </w:rPr>
+        <w:t xml:space="preserve"> </w:t>
+      </w:r>
+      <w:r>
+        <w:rPr>
+          <w:bCs/>
+          <w:b/>
+        </w:rPr>
+        <w:t xml:space="preserve">e prejuízo exigível.</w:t>
+      </w:r>
+      <w:r>
+        <w:t xml:space="preserve"> </w:t>
+      </w:r>
+      <w:r>
+        <w:t xml:space="preserve">Convém distinguir duas camadas de exame, que a versão anterior desta Nota não separava com clareza:</w:t>
+      </w:r>
+      <w:r>
+        <w:t xml:space="preserve"> </w:t>
+      </w:r>
+      <w:r>
+        <w:t xml:space="preserve">- (i)</w:t>
+      </w:r>
+      <w:r>
+        <w:t xml:space="preserve"> </w:t>
+      </w:r>
+      <w:r>
+        <w:rPr>
+          <w:bCs/>
+          <w:b/>
+        </w:rPr>
+        <w:t xml:space="preserve">Camada literal (art. 2º, II).</w:t>
+      </w:r>
+      <w:r>
+        <w:t xml:space="preserve"> </w:t>
+      </w:r>
+      <w:r>
+        <w:t xml:space="preserve">Houve indicação de prejuízo por órgão ou agente da Administração Pública? A CPAR integra a Administração, de modo que seu Relatório Final pode, em tese, conter tal indicação.</w:t>
+      </w:r>
+      <w:r>
+        <w:t xml:space="preserve"> </w:t>
+      </w:r>
+      <w:r>
+        <w:t xml:space="preserve">- (ii)</w:t>
+      </w:r>
+      <w:r>
+        <w:t xml:space="preserve"> </w:t>
+      </w:r>
+      <w:r>
+        <w:rPr>
+          <w:bCs/>
+          <w:b/>
+        </w:rPr>
+        <w:t xml:space="preserve">Camada metodológica (art. 2º, § 1º, conforme interpretado pela CGU).</w:t>
+      </w:r>
+      <w:r>
+        <w:t xml:space="preserve"> </w:t>
+      </w:r>
+      <w:r>
+        <w:t xml:space="preserve">O prejuízo indicado está quantificado e decorre de admissão da pessoa jurídica ou de decisão administrativa ou judicial definitiva, com nexo causal com o ato sancionado? Esse é o conceito de dano incontroverso do art. 37, § 2º, do Decreto nº 11.129/2022 e do art. 33 da PNI nº 1/2025, adotado no precedente [D15, itens 4.14, 4.17 e 4.48].</w:t>
+      </w:r>
+    </w:p>
+    <w:p>
+      <w:pPr>
+        <w:pStyle w:val="BodyText"/>
+      </w:pPr>
+      <w:r>
+        <w:t xml:space="preserve">O relatório de comissão processante é peça opinativa. A indicação nele contida só satisfaz a segunda camada se incorporada pela autoridade julgadora e se identificar e quantificar o dano com nexo causal. A expressão</w:t>
+      </w:r>
+      <w:r>
+        <w:t xml:space="preserve"> </w:t>
+      </w:r>
+      <w:r>
+        <w:t xml:space="preserve">“</w:t>
+      </w:r>
+      <w:r>
+        <w:t xml:space="preserve">no mínimo, o montante pago a título de vantagem indevida</w:t>
+      </w:r>
+      <w:r>
+        <w:t xml:space="preserve">”</w:t>
+      </w:r>
+      <w:r>
+        <w:t xml:space="preserve"> </w:t>
+      </w:r>
+      <w:r>
+        <w:t xml:space="preserve">é estimativa por</w:t>
+      </w:r>
+      <w:r>
+        <w:t xml:space="preserve"> </w:t>
+      </w:r>
+      <w:r>
+        <w:rPr>
+          <w:iCs/>
+          <w:i/>
+        </w:rPr>
+        <w:t xml:space="preserve">proxy</w:t>
+      </w:r>
+      <w:r>
+        <w:t xml:space="preserve">. Ainda que adotada, pode não preencher esse padrão (Seções 8.4 e 9.4).</w:t>
+      </w:r>
+    </w:p>
+    <w:p>
+      <w:pPr>
+        <w:pStyle w:val="BodyText"/>
+      </w:pPr>
+      <w:r>
         <w:t xml:space="preserve">5.3.</w:t>
       </w:r>
       <w:r>
@@ -4374,7 +4640,7 @@
         <w:t xml:space="preserve">acordos ou instrumentos consensuais</w:t>
       </w:r>
       <w:r>
-        <w:t xml:space="preserve">: não há nos autos acordo de leniência, termo de compromisso ou ajuste envolvendo a DECAL;</w:t>
+        <w:t xml:space="preserve">: não há nos autos acordo de leniência, termo de compromisso ou ajuste envolvendo a DECAL. Mesmo que houvesse, o acordo não exime da obrigação de reparar integralmente o dano (art. 16, § 3º, da Lei nº 12.846/2013);</w:t>
       </w:r>
       <w:r>
         <w:t xml:space="preserve"> </w:t>
@@ -4548,7 +4814,7 @@
         <w:t xml:space="preserve">”</w:t>
       </w:r>
       <w:r>
-        <w:t xml:space="preserve">. Essa redação vigorava na data dos fatos (2011-2014), da sanção (2023) e do pedido (2026). Embora a Lei nº 8.666/1993 tenha sido revogada pela Lei nº 14.133/2021 (art. 193), a sanção aplicada com base nela e seus efeitos, inclusive a reabilitação, continuam regidos pelo regime sob o qual foi imposta. Esse é o entendimento adotado pela CGU no precedente [D15, item 4.1] e postulado pela própria DECAL [D11, §§ 20-21].</w:t>
+        <w:t xml:space="preserve">. Essa redação, inalterada desde 1993, vigorava na data dos fatos (2011-2014) e na da sanção (fevereiro e outubro de 2023). Na data do pedido (2026), a Lei nº 8.666/1993 já estava revogada pela Lei nº 14.133/2021 (art. 193, II; revogação efetivada ao final de 2023). A sanção aplicada com base nela e seus efeitos, inclusive a reabilitação, continuam regidos pelo regime sob o qual foi imposta (ultratividade). Esse é o entendimento adotado pela CGU no precedente [D15, item 4.1] e postulado pela própria DECAL [D11, §§ 20-21].</w:t>
       </w:r>
     </w:p>
     <w:p>
@@ -4624,7 +4890,7 @@
         <w:t xml:space="preserve"> </w:t>
       </w:r>
       <w:r>
-        <w:t xml:space="preserve">- A Portaria Normativa CGU nº 54/2023 alterou os arts. 1º e 3º a 6º, transferindo o processamento à SIPRI/DPI, e manteve a redação do inciso II e do § 2º do art. 4º, que autoriza a DPI a</w:t>
+        <w:t xml:space="preserve">- A Portaria Normativa CGU nº 54/2023 alterou os arts. 3º a 6º, transferindo o processamento da CRG/DIREP para a SIPRI/DPI. O § 2º do art. 4º passou a atribuir à DPI a faculdade de</w:t>
       </w:r>
       <w:r>
         <w:t xml:space="preserve"> </w:t>
@@ -4642,7 +4908,13 @@
         <w:t xml:space="preserve"> </w:t>
       </w:r>
       <w:r>
-        <w:t xml:space="preserve">[D15, itens 4.2-4.3]. Essas normas procedimentais aplicam-se ao pedido em curso (</w:t>
+        <w:t xml:space="preserve">[D15, item 4.3 — transcrição oficial]. Segundo fontes secundárias, a PN nº 54/2023 também alterou o art. 1º e a remissão do inciso III do art. 2º (que passou ao Decreto nº 11.129/2022). Nenhuma fonte consultada indica alteração do inciso II ou do § 1º do art. 2º, e a transcrição do art. 2º, II, na NT nº 676/2026 é idêntica à redação original [D15, item 4.2; D18]. A redação consolidada oficial não pôde ser conferida (Seção VI-A).</w:t>
+      </w:r>
+      <w:r>
+        <w:t xml:space="preserve"> </w:t>
+      </w:r>
+      <w:r>
+        <w:t xml:space="preserve">- As normas procedimentais aplicam-se ao pedido em curso (</w:t>
       </w:r>
       <w:r>
         <w:rPr>
@@ -4765,35 +5037,150 @@
           <w:bCs/>
           <w:b/>
         </w:rPr>
-        <w:t xml:space="preserve">Solução intertemporal proposta.</w:t>
-      </w:r>
-      <w:r>
-        <w:t xml:space="preserve"> </w:t>
-      </w:r>
-      <w:r>
-        <w:t xml:space="preserve">A remissão do § 1º é de natureza instrumental (definições e método de aferição). A revogação da norma remetida e sua substituição por disciplina com o mesmo objeto justificam adotar, na data da análise, os conceitos vigentes, como fez o precedente. Isso não altera o requisito legal, preserva a isonomia entre interessados em situação equivalente (LINDB, art. 30) e evita aplicar retroativamente uma nova interpretação ao caso (Lei nº 9.784/1999, art. 2º, parágrafo único, XIII).</w:t>
-      </w:r>
-      <w:r>
-        <w:t xml:space="preserve"> </w:t>
-      </w:r>
-      <w:r>
-        <w:t xml:space="preserve">- Mesmo pela IN nº 2/2018, a inclusão automática da propina valia como metodologia de negociação de acordos de leniência, em que há admissão de responsabilidade. Para fins de reabilitação, o próprio precedente condiciona o uso da propina como</w:t>
-      </w:r>
-      <w:r>
-        <w:t xml:space="preserve"> </w:t>
+        <w:t xml:space="preserve">Duas interpretações plausíveis sobre a norma aplicável ao § 1º:</w:t>
+      </w:r>
+      <w:r>
+        <w:t xml:space="preserve"> </w:t>
+      </w:r>
+      <w:r>
+        <w:t xml:space="preserve">-</w:t>
+      </w:r>
+      <w:r>
+        <w:t xml:space="preserve"> </w:t>
+      </w:r>
+      <w:r>
+        <w:rPr>
+          <w:bCs/>
+          <w:b/>
+        </w:rPr>
+        <w:t xml:space="preserve">Interpretação 1 — ultratividade da IN nº 2/2018.</w:t>
+      </w:r>
+      <w:r>
+        <w:t xml:space="preserve"> </w:t>
+      </w:r>
+      <w:r>
+        <w:t xml:space="preserve">A IN vigorava quando os fatos foram apurados, quando o Relatório Final foi elaborado e quando a sanção foi aplicada. Sendo a norma expressamente eleita pelo § 1º para a</w:t>
+      </w:r>
+      <w:r>
+        <w:t xml:space="preserve"> </w:t>
+      </w:r>
+      <w:r>
+        <w:t xml:space="preserve">“</w:t>
+      </w:r>
+      <w:r>
+        <w:t xml:space="preserve">comprovação</w:t>
+      </w:r>
+      <w:r>
+        <w:t xml:space="preserve">”</w:t>
+      </w:r>
+      <w:r>
+        <w:t xml:space="preserve"> </w:t>
+      </w:r>
+      <w:r>
+        <w:t xml:space="preserve">do inciso II, o ressarcimento abrangeria o somatório das propinas pagas, aproximadamente USD 868.450,00. A empresa não teria demonstrado o pagamento, e a conclusão tenderia à Alternativa B.</w:t>
+      </w:r>
+      <w:r>
+        <w:t xml:space="preserve"> </w:t>
+      </w:r>
+      <w:r>
+        <w:t xml:space="preserve">-</w:t>
+      </w:r>
+      <w:r>
+        <w:t xml:space="preserve"> </w:t>
+      </w:r>
+      <w:r>
+        <w:rPr>
+          <w:bCs/>
+          <w:b/>
+        </w:rPr>
+        <w:t xml:space="preserve">Interpretação 2 — remissão instrumental e dinâmica.</w:t>
+      </w:r>
+      <w:r>
+        <w:t xml:space="preserve"> </w:t>
+      </w:r>
+      <w:r>
+        <w:t xml:space="preserve">O § 1º remete a definições e método de aferição, e não ao conteúdo da obrigação, que é legal (art. 87, IV). Revogada a norma remetida antes do pedido (21/09/2026) e da análise, aplicam-se os conceitos da disciplina que a sucedeu no mesmo objeto (PNI nº 1/2025, art. 33; Decreto nº 11.129/2022, art. 37, § 2º).</w:t>
+      </w:r>
+      <w:r>
+        <w:t xml:space="preserve"> </w:t>
+      </w:r>
+      <w:r>
+        <w:t xml:space="preserve">-</w:t>
+      </w:r>
+      <w:r>
+        <w:t xml:space="preserve"> </w:t>
+      </w:r>
+      <w:r>
+        <w:rPr>
+          <w:bCs/>
+          <w:b/>
+        </w:rPr>
+        <w:t xml:space="preserve">Interpretação que deve prevalecer: a 2.</w:t>
+      </w:r>
+      <w:r>
+        <w:t xml:space="preserve"> </w:t>
+      </w:r>
+      <w:r>
+        <w:t xml:space="preserve">Por quatro razões:</w:t>
+      </w:r>
+      <w:r>
+        <w:t xml:space="preserve"> </w:t>
+      </w:r>
+      <w:r>
+        <w:t xml:space="preserve">- (a) é a adotada pela CGU em caso equivalente de sanção da Lei nº 8.666/1993 decidido em 2026 [D15, itens 4.13-4.17]. Afastá-la exigiria motivação específica (Lei nº 9.784/1999, art. 50, VII) e romperia a coerência administrativa (LINDB, art. 30);</w:t>
+      </w:r>
+      <w:r>
+        <w:t xml:space="preserve"> </w:t>
+      </w:r>
+      <w:r>
+        <w:t xml:space="preserve">- (b) a IN nº 2/2018 era metodologia de cálculo para acordos de leniência, em que a pessoa jurídica admite responsabilidade e negocia valores. Transpô-la sem mediação para impor um débito a quem não o admitiu é solução menos compatível com a exigência de decisão definitiva ou admissão;</w:t>
+      </w:r>
+      <w:r>
+        <w:t xml:space="preserve"> </w:t>
+      </w:r>
+      <w:r>
+        <w:t xml:space="preserve">- (c) a obrigação de ressarcir não muda; muda apenas o critério de verificação, aplicado no momento da instrução (</w:t>
       </w:r>
       <w:r>
         <w:rPr>
           <w:iCs/>
           <w:i/>
         </w:rPr>
-        <w:t xml:space="preserve">proxy</w:t>
-      </w:r>
-      <w:r>
-        <w:t xml:space="preserve"> </w:t>
-      </w:r>
-      <w:r>
-        <w:t xml:space="preserve">de dano a que</w:t>
+        <w:t xml:space="preserve">tempus regit actum</w:t>
+      </w:r>
+      <w:r>
+        <w:t xml:space="preserve"> </w:t>
+      </w:r>
+      <w:r>
+        <w:t xml:space="preserve">procedimental);</w:t>
+      </w:r>
+      <w:r>
+        <w:t xml:space="preserve"> </w:t>
+      </w:r>
+      <w:r>
+        <w:t xml:space="preserve">- (d) a nova interpretação não agrava a situação do interessado, o que afasta a vedação do art. 2º, parágrafo único, XIII, da Lei nº 9.784/1999.</w:t>
+      </w:r>
+      <w:r>
+        <w:t xml:space="preserve"> </w:t>
+      </w:r>
+      <w:r>
+        <w:t xml:space="preserve">-</w:t>
+      </w:r>
+      <w:r>
+        <w:t xml:space="preserve"> </w:t>
+      </w:r>
+      <w:r>
+        <w:rPr>
+          <w:bCs/>
+          <w:b/>
+        </w:rPr>
+        <w:t xml:space="preserve">Convergência das duas leituras.</w:t>
+      </w:r>
+      <w:r>
+        <w:t xml:space="preserve"> </w:t>
+      </w:r>
+      <w:r>
+        <w:t xml:space="preserve">Mesmo sob a Interpretação 2, o precedente mantém a propina como possível dano incontroverso</w:t>
       </w:r>
       <w:r>
         <w:t xml:space="preserve"> </w:t>
@@ -4802,7 +5189,7 @@
         <w:t xml:space="preserve">“</w:t>
       </w:r>
       <w:r>
-        <w:t xml:space="preserve">o tipo específico de ilícito praticado assim indicar</w:t>
+        <w:t xml:space="preserve">quando o tipo específico de ilícito praticado assim indicar</w:t>
       </w:r>
       <w:r>
         <w:t xml:space="preserve">”</w:t>
@@ -4811,7 +5198,7 @@
         <w:t xml:space="preserve"> </w:t>
       </w:r>
       <w:r>
-        <w:t xml:space="preserve">[D15, item 4.17].</w:t>
+        <w:t xml:space="preserve">[D15, itens 4.16-4.17]. As duas leituras convergem, portanto, para a mesma questão de fato: houve ou não repasse do custo da propina à Petrobras? Essa questão é examinada na Seção 8.4. A escolha deve ser confirmada pela CONJUR, por ser controvertida.</w:t>
       </w:r>
     </w:p>
     <w:p>
@@ -4919,6 +5306,651 @@
       </w:r>
       <w:r>
         <w:t xml:space="preserve">, como no precedente, e não como fonte de obrigação nova.</w:t>
+      </w:r>
+    </w:p>
+    <w:p>
+      <w:pPr>
+        <w:pStyle w:val="BodyText"/>
+      </w:pPr>
+      <w:r>
+        <w:t xml:space="preserve">6.5-A.</w:t>
+      </w:r>
+      <w:r>
+        <w:t xml:space="preserve"> </w:t>
+      </w:r>
+      <w:r>
+        <w:rPr>
+          <w:bCs/>
+          <w:b/>
+        </w:rPr>
+        <w:t xml:space="preserve">Quadro de conferência normativa (Seção VI-A).</w:t>
+      </w:r>
+    </w:p>
+    <w:tbl>
+      <w:tblPr>
+        <w:tblStyle w:val="Table"/>
+        <w:tblW w:type="pct" w:w="5000"/>
+        <w:tblLook w:firstRow="1" w:lastRow="0" w:firstColumn="0" w:lastColumn="0" w:noHBand="0" w:noVBand="0" w:val="0020"/>
+        <w:jc w:val="start"/>
+      </w:tblPr>
+      <w:tblGrid>
+        <w:gridCol w:w="1980"/>
+        <w:gridCol w:w="1980"/>
+        <w:gridCol w:w="1980"/>
+        <w:gridCol w:w="1980"/>
+      </w:tblGrid>
+      <w:tr>
+        <w:trPr>
+          <w:tblHeader w:val="true"/>
+        </w:trPr>
+        <w:tc>
+          <w:tcPr/>
+          <w:p>
+            <w:pPr>
+              <w:pStyle w:val="Compact"/>
+              <w:jc w:val="left"/>
+            </w:pPr>
+            <w:r>
+              <w:t xml:space="preserve">Dispositivo</w:t>
+            </w:r>
+          </w:p>
+        </w:tc>
+        <w:tc>
+          <w:tcPr/>
+          <w:p>
+            <w:pPr>
+              <w:pStyle w:val="Compact"/>
+              <w:jc w:val="left"/>
+            </w:pPr>
+            <w:r>
+              <w:t xml:space="preserve">Redação aplicável</w:t>
+            </w:r>
+          </w:p>
+        </w:tc>
+        <w:tc>
+          <w:tcPr/>
+          <w:p>
+            <w:pPr>
+              <w:pStyle w:val="Compact"/>
+              <w:jc w:val="left"/>
+            </w:pPr>
+            <w:r>
+              <w:t xml:space="preserve">Fonte da conferência</w:t>
+            </w:r>
+          </w:p>
+        </w:tc>
+        <w:tc>
+          <w:tcPr/>
+          <w:p>
+            <w:pPr>
+              <w:pStyle w:val="Compact"/>
+              <w:jc w:val="left"/>
+            </w:pPr>
+            <w:r>
+              <w:t xml:space="preserve">Situação</w:t>
+            </w:r>
+          </w:p>
+        </w:tc>
+      </w:tr>
+      <w:tr>
+        <w:tc>
+          <w:tcPr/>
+          <w:p>
+            <w:pPr>
+              <w:pStyle w:val="Compact"/>
+              <w:jc w:val="left"/>
+            </w:pPr>
+            <w:r>
+              <w:t xml:space="preserve">Portaria CGU 1.214/2020, arts. 1º a 8º (redação original)</w:t>
+            </w:r>
+          </w:p>
+        </w:tc>
+        <w:tc>
+          <w:tcPr/>
+          <w:p>
+            <w:pPr>
+              <w:pStyle w:val="Compact"/>
+              <w:jc w:val="left"/>
+            </w:pPr>
+            <w:r>
+              <w:t xml:space="preserve">2020</w:t>
+            </w:r>
+          </w:p>
+        </w:tc>
+        <w:tc>
+          <w:tcPr/>
+          <w:p>
+            <w:pPr>
+              <w:pStyle w:val="Compact"/>
+              <w:jc w:val="left"/>
+            </w:pPr>
+            <w:r>
+              <w:t xml:space="preserve">DOU de 09/06/2020 [D18]</w:t>
+            </w:r>
+          </w:p>
+        </w:tc>
+        <w:tc>
+          <w:tcPr/>
+          <w:p>
+            <w:pPr>
+              <w:pStyle w:val="Compact"/>
+              <w:jc w:val="left"/>
+            </w:pPr>
+            <w:r>
+              <w:rPr>
+                <w:bCs/>
+                <w:b/>
+              </w:rPr>
+              <w:t xml:space="preserve">Conferido em fonte oficial</w:t>
+            </w:r>
+          </w:p>
+        </w:tc>
+      </w:tr>
+      <w:tr>
+        <w:tc>
+          <w:tcPr/>
+          <w:p>
+            <w:pPr>
+              <w:pStyle w:val="Compact"/>
+              <w:jc w:val="left"/>
+            </w:pPr>
+            <w:r>
+              <w:t xml:space="preserve">Portaria 1.214, arts. 2º, II, 3º a 6º (com a PN 54/2023)</w:t>
+            </w:r>
+          </w:p>
+        </w:tc>
+        <w:tc>
+          <w:tcPr/>
+          <w:p>
+            <w:pPr>
+              <w:pStyle w:val="Compact"/>
+              <w:jc w:val="left"/>
+            </w:pPr>
+            <w:r>
+              <w:t xml:space="preserve">Desde 2023</w:t>
+            </w:r>
+          </w:p>
+        </w:tc>
+        <w:tc>
+          <w:tcPr/>
+          <w:p>
+            <w:pPr>
+              <w:pStyle w:val="Compact"/>
+              <w:jc w:val="left"/>
+            </w:pPr>
+            <w:r>
+              <w:t xml:space="preserve">Transcrição em ato oficial da CGU [D15]</w:t>
+            </w:r>
+          </w:p>
+        </w:tc>
+        <w:tc>
+          <w:tcPr/>
+          <w:p>
+            <w:pPr>
+              <w:pStyle w:val="Compact"/>
+              <w:jc w:val="left"/>
+            </w:pPr>
+            <w:r>
+              <w:rPr>
+                <w:bCs/>
+                <w:b/>
+              </w:rPr>
+              <w:t xml:space="preserve">Conferido em transcrição oficial</w:t>
+            </w:r>
+          </w:p>
+        </w:tc>
+      </w:tr>
+      <w:tr>
+        <w:tc>
+          <w:tcPr/>
+          <w:p>
+            <w:pPr>
+              <w:pStyle w:val="Compact"/>
+              <w:jc w:val="left"/>
+            </w:pPr>
+            <w:r>
+              <w:t xml:space="preserve">PN 54/2023 — alterações dos arts. 1º e 2º, III</w:t>
+            </w:r>
+          </w:p>
+        </w:tc>
+        <w:tc>
+          <w:tcPr/>
+          <w:p>
+            <w:pPr>
+              <w:pStyle w:val="Compact"/>
+              <w:jc w:val="left"/>
+            </w:pPr>
+            <w:r>
+              <w:t xml:space="preserve">Desde 2023</w:t>
+            </w:r>
+          </w:p>
+        </w:tc>
+        <w:tc>
+          <w:tcPr/>
+          <w:p>
+            <w:pPr>
+              <w:pStyle w:val="Compact"/>
+              <w:jc w:val="left"/>
+            </w:pPr>
+            <w:r>
+              <w:t xml:space="preserve">Fontes secundárias</w:t>
+            </w:r>
+          </w:p>
+        </w:tc>
+        <w:tc>
+          <w:tcPr/>
+          <w:p>
+            <w:pPr>
+              <w:pStyle w:val="Compact"/>
+              <w:jc w:val="left"/>
+            </w:pPr>
+            <w:r>
+              <w:rPr>
+                <w:bCs/>
+                <w:b/>
+              </w:rPr>
+              <w:t xml:space="preserve">Pendente</w:t>
+            </w:r>
+          </w:p>
+        </w:tc>
+      </w:tr>
+      <w:tr>
+        <w:tc>
+          <w:tcPr/>
+          <w:p>
+            <w:pPr>
+              <w:pStyle w:val="Compact"/>
+              <w:jc w:val="left"/>
+            </w:pPr>
+            <w:r>
+              <w:t xml:space="preserve">PNI CGU/AGU 1/2025, arts. 4º, 33, 34, 59, 60 e 61</w:t>
+            </w:r>
+          </w:p>
+        </w:tc>
+        <w:tc>
+          <w:tcPr/>
+          <w:p>
+            <w:pPr>
+              <w:pStyle w:val="Compact"/>
+              <w:jc w:val="left"/>
+            </w:pPr>
+            <w:r>
+              <w:t xml:space="preserve">Desde 23/12/2025</w:t>
+            </w:r>
+          </w:p>
+        </w:tc>
+        <w:tc>
+          <w:tcPr/>
+          <w:p>
+            <w:pPr>
+              <w:pStyle w:val="Compact"/>
+              <w:jc w:val="left"/>
+            </w:pPr>
+            <w:r>
+              <w:t xml:space="preserve">DOU [D19]</w:t>
+            </w:r>
+          </w:p>
+        </w:tc>
+        <w:tc>
+          <w:tcPr/>
+          <w:p>
+            <w:pPr>
+              <w:pStyle w:val="Compact"/>
+              <w:jc w:val="left"/>
+            </w:pPr>
+            <w:r>
+              <w:rPr>
+                <w:bCs/>
+                <w:b/>
+              </w:rPr>
+              <w:t xml:space="preserve">Conferido em fonte oficial</w:t>
+            </w:r>
+          </w:p>
+        </w:tc>
+      </w:tr>
+      <w:tr>
+        <w:tc>
+          <w:tcPr/>
+          <w:p>
+            <w:pPr>
+              <w:pStyle w:val="Compact"/>
+              <w:jc w:val="left"/>
+            </w:pPr>
+            <w:r>
+              <w:t xml:space="preserve">Decreto 11.129/2022, arts. 26 e 37, § 2º</w:t>
+            </w:r>
+          </w:p>
+        </w:tc>
+        <w:tc>
+          <w:tcPr/>
+          <w:p>
+            <w:pPr>
+              <w:pStyle w:val="Compact"/>
+              <w:jc w:val="left"/>
+            </w:pPr>
+            <w:r>
+              <w:t xml:space="preserve">Desde 2022</w:t>
+            </w:r>
+          </w:p>
+        </w:tc>
+        <w:tc>
+          <w:tcPr/>
+          <w:p>
+            <w:pPr>
+              <w:pStyle w:val="Compact"/>
+              <w:jc w:val="left"/>
+            </w:pPr>
+            <w:r>
+              <w:t xml:space="preserve">Transcrição em ato oficial da CGU [D15]</w:t>
+            </w:r>
+          </w:p>
+        </w:tc>
+        <w:tc>
+          <w:tcPr/>
+          <w:p>
+            <w:pPr>
+              <w:pStyle w:val="Compact"/>
+              <w:jc w:val="left"/>
+            </w:pPr>
+            <w:r>
+              <w:rPr>
+                <w:bCs/>
+                <w:b/>
+              </w:rPr>
+              <w:t xml:space="preserve">Conferido em transcrição oficial</w:t>
+            </w:r>
+          </w:p>
+        </w:tc>
+      </w:tr>
+      <w:tr>
+        <w:tc>
+          <w:tcPr/>
+          <w:p>
+            <w:pPr>
+              <w:pStyle w:val="Compact"/>
+              <w:jc w:val="left"/>
+            </w:pPr>
+            <w:r>
+              <w:t xml:space="preserve">Lei 8.666/1993, art. 87, IV e § 3º</w:t>
+            </w:r>
+          </w:p>
+        </w:tc>
+        <w:tc>
+          <w:tcPr/>
+          <w:p>
+            <w:pPr>
+              <w:pStyle w:val="Compact"/>
+              <w:jc w:val="left"/>
+            </w:pPr>
+            <w:r>
+              <w:t xml:space="preserve">1993-2023 (ultrativo)</w:t>
+            </w:r>
+          </w:p>
+        </w:tc>
+        <w:tc>
+          <w:tcPr/>
+          <w:p>
+            <w:pPr>
+              <w:pStyle w:val="Compact"/>
+              <w:jc w:val="left"/>
+            </w:pPr>
+            <w:r>
+              <w:t xml:space="preserve">Transcrição da requerente [D11]; texto notório</w:t>
+            </w:r>
+          </w:p>
+        </w:tc>
+        <w:tc>
+          <w:tcPr/>
+          <w:p>
+            <w:pPr>
+              <w:pStyle w:val="Compact"/>
+              <w:jc w:val="left"/>
+            </w:pPr>
+            <w:r>
+              <w:rPr>
+                <w:bCs/>
+                <w:b/>
+              </w:rPr>
+              <w:t xml:space="preserve">Pendente de conferência oficial</w:t>
+            </w:r>
+            <w:r>
+              <w:t xml:space="preserve"> </w:t>
+            </w:r>
+            <w:r>
+              <w:t xml:space="preserve">(redação convergente em D11 e D15)</w:t>
+            </w:r>
+          </w:p>
+        </w:tc>
+      </w:tr>
+      <w:tr>
+        <w:tc>
+          <w:tcPr/>
+          <w:p>
+            <w:pPr>
+              <w:pStyle w:val="Compact"/>
+              <w:jc w:val="left"/>
+            </w:pPr>
+            <w:r>
+              <w:t xml:space="preserve">Lei 12.846/2013, arts. 6º, § 3º, 13, 16, § 3º, 19 e 21</w:t>
+            </w:r>
+          </w:p>
+        </w:tc>
+        <w:tc>
+          <w:tcPr/>
+          <w:p>
+            <w:pPr>
+              <w:pStyle w:val="Compact"/>
+              <w:jc w:val="left"/>
+            </w:pPr>
+            <w:r>
+              <w:t xml:space="preserve">Redação original</w:t>
+            </w:r>
+          </w:p>
+        </w:tc>
+        <w:tc>
+          <w:tcPr/>
+          <w:p>
+            <w:pPr>
+              <w:pStyle w:val="Compact"/>
+              <w:jc w:val="left"/>
+            </w:pPr>
+            <w:r>
+              <w:t xml:space="preserve">Não conferido</w:t>
+            </w:r>
+          </w:p>
+        </w:tc>
+        <w:tc>
+          <w:tcPr/>
+          <w:p>
+            <w:pPr>
+              <w:pStyle w:val="Compact"/>
+              <w:jc w:val="left"/>
+            </w:pPr>
+            <w:r>
+              <w:rPr>
+                <w:bCs/>
+                <w:b/>
+              </w:rPr>
+              <w:t xml:space="preserve">Pendente</w:t>
+            </w:r>
+          </w:p>
+        </w:tc>
+      </w:tr>
+      <w:tr>
+        <w:tc>
+          <w:tcPr/>
+          <w:p>
+            <w:pPr>
+              <w:pStyle w:val="Compact"/>
+              <w:jc w:val="left"/>
+            </w:pPr>
+            <w:r>
+              <w:t xml:space="preserve">Lei 9.784/1999; LINDB; CC, art. 935; CPP, arts. 63, 66, 67 e 387, IV; CPC, art. 506; CP, art. 91</w:t>
+            </w:r>
+          </w:p>
+        </w:tc>
+        <w:tc>
+          <w:tcPr/>
+          <w:p>
+            <w:pPr>
+              <w:pStyle w:val="Compact"/>
+              <w:jc w:val="left"/>
+            </w:pPr>
+            <w:r>
+              <w:t xml:space="preserve">Vigentes</w:t>
+            </w:r>
+          </w:p>
+        </w:tc>
+        <w:tc>
+          <w:tcPr/>
+          <w:p>
+            <w:pPr>
+              <w:pStyle w:val="Compact"/>
+              <w:jc w:val="left"/>
+            </w:pPr>
+            <w:r>
+              <w:t xml:space="preserve">Art. 935 do CC transcrito em D11; demais não conferidos</w:t>
+            </w:r>
+          </w:p>
+        </w:tc>
+        <w:tc>
+          <w:tcPr/>
+          <w:p>
+            <w:pPr>
+              <w:pStyle w:val="Compact"/>
+              <w:jc w:val="left"/>
+            </w:pPr>
+            <w:r>
+              <w:rPr>
+                <w:bCs/>
+                <w:b/>
+              </w:rPr>
+              <w:t xml:space="preserve">Pendente</w:t>
+            </w:r>
+          </w:p>
+        </w:tc>
+      </w:tr>
+      <w:tr>
+        <w:tc>
+          <w:tcPr/>
+          <w:p>
+            <w:pPr>
+              <w:pStyle w:val="Compact"/>
+              <w:jc w:val="left"/>
+            </w:pPr>
+            <w:r>
+              <w:t xml:space="preserve">Lei 14.133/2021, arts. 163 e 193</w:t>
+            </w:r>
+          </w:p>
+        </w:tc>
+        <w:tc>
+          <w:tcPr/>
+          <w:p>
+            <w:pPr>
+              <w:pStyle w:val="Compact"/>
+              <w:jc w:val="left"/>
+            </w:pPr>
+            <w:r>
+              <w:t xml:space="preserve">Vigentes</w:t>
+            </w:r>
+          </w:p>
+        </w:tc>
+        <w:tc>
+          <w:tcPr/>
+          <w:p>
+            <w:pPr>
+              <w:pStyle w:val="Compact"/>
+              <w:jc w:val="left"/>
+            </w:pPr>
+            <w:r>
+              <w:t xml:space="preserve">Fontes secundárias</w:t>
+            </w:r>
+          </w:p>
+        </w:tc>
+        <w:tc>
+          <w:tcPr/>
+          <w:p>
+            <w:pPr>
+              <w:pStyle w:val="Compact"/>
+              <w:jc w:val="left"/>
+            </w:pPr>
+            <w:r>
+              <w:rPr>
+                <w:bCs/>
+                <w:b/>
+              </w:rPr>
+              <w:t xml:space="preserve">Pendente</w:t>
+            </w:r>
+            <w:r>
+              <w:t xml:space="preserve"> </w:t>
+            </w:r>
+            <w:r>
+              <w:t xml:space="preserve">(uso apenas delimitador)</w:t>
+            </w:r>
+          </w:p>
+        </w:tc>
+      </w:tr>
+      <w:tr>
+        <w:tc>
+          <w:tcPr/>
+          <w:p>
+            <w:pPr>
+              <w:pStyle w:val="Compact"/>
+              <w:jc w:val="left"/>
+            </w:pPr>
+            <w:r>
+              <w:t xml:space="preserve">PN SE/CGU 226/2025</w:t>
+            </w:r>
+          </w:p>
+        </w:tc>
+        <w:tc>
+          <w:tcPr/>
+          <w:p>
+            <w:pPr>
+              <w:pStyle w:val="Compact"/>
+              <w:jc w:val="left"/>
+            </w:pPr>
+            <w:r>
+              <w:t xml:space="preserve">Desde 09-11/09/2025</w:t>
+            </w:r>
+          </w:p>
+        </w:tc>
+        <w:tc>
+          <w:tcPr/>
+          <w:p>
+            <w:pPr>
+              <w:pStyle w:val="Compact"/>
+              <w:jc w:val="left"/>
+            </w:pPr>
+            <w:r>
+              <w:t xml:space="preserve">Fontes secundárias; transcrição do art. 20 em D11</w:t>
+            </w:r>
+          </w:p>
+        </w:tc>
+        <w:tc>
+          <w:tcPr/>
+          <w:p>
+            <w:pPr>
+              <w:pStyle w:val="Compact"/>
+              <w:jc w:val="left"/>
+            </w:pPr>
+            <w:r>
+              <w:rPr>
+                <w:bCs/>
+                <w:b/>
+              </w:rPr>
+              <w:t xml:space="preserve">Pendente</w:t>
+            </w:r>
+          </w:p>
+        </w:tc>
+      </w:tr>
+    </w:tbl>
+    <w:p>
+      <w:pPr>
+        <w:pStyle w:val="BodyText"/>
+      </w:pPr>
+      <w:r>
+        <w:t xml:space="preserve">A conferência pendente não altera, em princípio, o raciocínio: as redações empregadas são estáveis e os pontos centrais estão conferidos em fonte oficial ou em transcrição oficial. A conferência deve, porém, preceder a assinatura.</w:t>
       </w:r>
     </w:p>
     <w:p>
@@ -6051,7 +7083,7 @@
         <w:t xml:space="preserve"> </w:t>
       </w:r>
       <w:r>
-        <w:t xml:space="preserve">de O2 pode já ter sido recebido pelo ente lesado. Exigi-lo também da DECAL importaria risco de recomposição em duplicidade, ressalvada a distinta natureza jurídica do confisco. A destinação final é controvertida e não comprovada (O4).</w:t>
+        <w:t xml:space="preserve">de O2 pode já ter sido recebido pelo ente lesado. Exigi-lo também da DECAL importaria risco de recomposição em duplicidade. A destinação final é controvertida e não comprovada (O4).</w:t>
       </w:r>
       <w:r>
         <w:t xml:space="preserve"> </w:t>
@@ -6062,6 +7094,32 @@
           <w:b/>
         </w:rPr>
         <w:t xml:space="preserve">[DILIGÊNCIA D6]</w:t>
+      </w:r>
+    </w:p>
+    <w:p>
+      <w:pPr>
+        <w:pStyle w:val="BodyText"/>
+      </w:pPr>
+      <w:r>
+        <w:t xml:space="preserve">Ressalva jurídica: o confisco é efeito da condenação penal (perda do produto ou proveito do crime,</w:t>
+      </w:r>
+      <w:r>
+        <w:t xml:space="preserve"> </w:t>
+      </w:r>
+      <w:r>
+        <w:t xml:space="preserve">“</w:t>
+      </w:r>
+      <w:r>
+        <w:t xml:space="preserve">ressalvado o direito do lesado ou de terceiro de boa-fé</w:t>
+      </w:r>
+      <w:r>
+        <w:t xml:space="preserve">”</w:t>
+      </w:r>
+      <w:r>
+        <w:t xml:space="preserve"> </w:t>
+      </w:r>
+      <w:r>
+        <w:t xml:space="preserve">— art. 91, II, do CP), imposto a pessoa diversa da DECAL. Não é, em si, pagamento de indenização. Saber se valores confiscados e revertidos à vítima podem ser imputados ao prejuízo eventualmente exigível da DECAL depende de juízo jurídico ainda não feito, que deve ser submetido à CONJUR. Esse juízo envolve a eventual corresponsabilidade civil entre a pessoa física e a pessoa jurídica pelo mesmo dano e a vedação ao enriquecimento sem causa do credor. Por isso, a dedução não é tratada nesta Nota como certa.</w:t>
       </w:r>
     </w:p>
     <w:p>
@@ -6332,7 +7390,48 @@
         <w:t xml:space="preserve">incontroversa e não favorece a DECAL</w:t>
       </w:r>
       <w:r>
-        <w:t xml:space="preserve">: a própria lei exige o ressarcimento. A DECAL cita o RMS nº 33.526/DF (STF, Rel. Min. Gilmar Mendes). Busca em fonte secundária indica que o agravo regimental foi desprovido pela 2ª Turma em 29/09/2017, com ementa sobre o art. 87, IV, da Lei nº 8.666/1993 e a impossibilidade de restrição de direitos por prazo indeterminado. O inteiro teor não pôde ser conferido (Anexo C).</w:t>
+        <w:t xml:space="preserve">: a própria lei exige o ressarcimento. A DECAL cita o RMS nº 33.526/DF (STF, Rel. Min. Gilmar Mendes) como</w:t>
+      </w:r>
+      <w:r>
+        <w:t xml:space="preserve"> </w:t>
+      </w:r>
+      <w:r>
+        <w:t xml:space="preserve">“</w:t>
+      </w:r>
+      <w:r>
+        <w:t xml:space="preserve">decisão monocrática transitada em julgado</w:t>
+      </w:r>
+      <w:r>
+        <w:t xml:space="preserve">”</w:t>
+      </w:r>
+      <w:r>
+        <w:t xml:space="preserve">. Segundo fontes secundárias:</w:t>
+      </w:r>
+      <w:r>
+        <w:t xml:space="preserve"> </w:t>
+      </w:r>
+      <w:r>
+        <w:t xml:space="preserve">- a decisão monocrática foi impugnada pela União por agravo regimental;</w:t>
+      </w:r>
+      <w:r>
+        <w:t xml:space="preserve"> </w:t>
+      </w:r>
+      <w:r>
+        <w:t xml:space="preserve">- a 2ª Turma negou provimento ao agravo, por unanimidade, em sessão virtual de 22 a 28/09/2017 (DJe de 09/10/2017);</w:t>
+      </w:r>
+      <w:r>
+        <w:t xml:space="preserve"> </w:t>
+      </w:r>
+      <w:r>
+        <w:t xml:space="preserve">- a ementa trata da sanção do art. 87, IV, da Lei nº 8.666/1993, da impossibilidade de restrição de direitos por prazo indeterminado, da temporariedade da pena (CF, art. 5º, XLVI e XLVII) e da prescritibilidade da pretensão de ressarcimento por ilícito civil.</w:t>
+      </w:r>
+    </w:p>
+    <w:p>
+      <w:pPr>
+        <w:pStyle w:val="BodyText"/>
+      </w:pPr>
+      <w:r>
+        <w:t xml:space="preserve">A caracterização feita pela DECAL omite a confirmação colegiada, o que não reduz, antes reforça, o peso do julgado. O inteiro teor não pôde ser conferido (Anexo C).</w:t>
       </w:r>
       <w:r>
         <w:t xml:space="preserve"> </w:t>
@@ -6404,6 +7503,12 @@
         <w:t xml:space="preserve"> </w:t>
       </w:r>
       <w:r>
+        <w:t xml:space="preserve">- Segundo fonte secundária, o Parecer nº 00241/2023/CONJUR-CGU/CGU/AGU (caso Mendes Júnior), não lido nesta análise, registra que a reabilitação não extingue a responsabilidade pelo dano, que pode ser cobrado quando calculado em definitivo pelas autoridades competentes. A orientação coincide com a ressalva da NT nº 676/2026 [D15, itens 4.47-4.48].</w:t>
+      </w:r>
+      <w:r>
+        <w:t xml:space="preserve"> </w:t>
+      </w:r>
+      <w:r>
         <w:t xml:space="preserve">-</w:t>
       </w:r>
       <w:r>
@@ -6868,7 +7973,7 @@
         <w:t xml:space="preserve"> </w:t>
       </w:r>
       <w:r>
-        <w:t xml:space="preserve">A DECAL não foi parte na ação penal. A coisa julgada vincula as partes (art. 506 do CPC). A Petrobras participou como assistente da acusação e apelante [D8, cabeçalho], o que reforça o valor do julgado perante ela, mas não converte a decisão em declaração vinculante de inexistência de dano em favor de terceiro.</w:t>
+        <w:t xml:space="preserve">A DECAL não foi parte na ação penal. A coisa julgada vincula as partes (art. 506 do CPC). A Petrobras figurou no polo ativo como apelante [D8, cabeçalho e relatório]. Isso reforça o valor do julgado perante ela quanto ao valor mínimo do art. 387, IV, mas não converte a decisão em declaração vinculante de inexistência de dano em favor de terceiro, nem impede a apuração do dano efetivo na esfera cível (art. 63, parágrafo único, do CPP).</w:t>
       </w:r>
       <w:r>
         <w:t xml:space="preserve"> </w:t>
@@ -7186,19 +8291,31 @@
           <w:bCs/>
           <w:b/>
         </w:rPr>
-        <w:t xml:space="preserve">Leitura que deve prevalecer.</w:t>
-      </w:r>
-      <w:r>
-        <w:t xml:space="preserve"> </w:t>
-      </w:r>
-      <w:r>
-        <w:t xml:space="preserve">Entre (a) e (b), a escolha depende do conteúdo dos documentos ausentes. Nenhuma das duas pode ser adotada com segurança antes de D1. Em qualquer hipótese, deixar de seguir o Relatório Final exige motivação expressa (art. 50, VII, da Lei nº 9.784/1999). A questão deverá ser submetida à CONJUR.</w:t>
-      </w:r>
-      <w:r>
-        <w:t xml:space="preserve"> </w:t>
-      </w:r>
-      <w:r>
-        <w:t xml:space="preserve">-</w:t>
+        <w:t xml:space="preserve">Questão prévia às duas leituras.</w:t>
+      </w:r>
+      <w:r>
+        <w:t xml:space="preserve"> </w:t>
+      </w:r>
+      <w:r>
+        <w:t xml:space="preserve">Ainda que adotado pela Decisão nº 9, um apontamento feito em PAR sancionador não constitui, por si, crédito de ressarcimento líquido. A Lei nº 12.846/2013 prevê processo administrativo específico para a reparação integral do dano, ao fim do qual o crédito é inscrito em dívida ativa (art. 13 e parágrafo único). O precedente da CGU exige</w:t>
+      </w:r>
+      <w:r>
+        <w:t xml:space="preserve"> </w:t>
+      </w:r>
+      <w:r>
+        <w:t xml:space="preserve">“</w:t>
+      </w:r>
+      <w:r>
+        <w:t xml:space="preserve">decisão administrativa ou judicial definitiva que tenha identificado e quantificado o dano, bem como estabelecido o nexo de causalidade</w:t>
+      </w:r>
+      <w:r>
+        <w:t xml:space="preserve">”</w:t>
+      </w:r>
+      <w:r>
+        <w:t xml:space="preserve"> </w:t>
+      </w:r>
+      <w:r>
+        <w:t xml:space="preserve">[D15, item 4.48]. A leitura (a) só se sustenta se a decisão sancionadora tiver efetivamente identificado e quantificado o dano, com nexo causal e contraditório sobre o</w:t>
       </w:r>
       <w:r>
         <w:t xml:space="preserve"> </w:t>
@@ -7208,6 +8325,63 @@
           <w:iCs/>
           <w:i/>
         </w:rPr>
+        <w:t xml:space="preserve">quantum</w:t>
+      </w:r>
+      <w:r>
+        <w:t xml:space="preserve">. Uma mera estimativa mínima por</w:t>
+      </w:r>
+      <w:r>
+        <w:t xml:space="preserve"> </w:t>
+      </w:r>
+      <w:r>
+        <w:rPr>
+          <w:iCs/>
+          <w:i/>
+        </w:rPr>
+        <w:t xml:space="preserve">proxy</w:t>
+      </w:r>
+      <w:r>
+        <w:t xml:space="preserve"> </w:t>
+      </w:r>
+      <w:r>
+        <w:t xml:space="preserve">pode não bastar.</w:t>
+      </w:r>
+      <w:r>
+        <w:t xml:space="preserve"> </w:t>
+      </w:r>
+      <w:r>
+        <w:t xml:space="preserve">-</w:t>
+      </w:r>
+      <w:r>
+        <w:t xml:space="preserve"> </w:t>
+      </w:r>
+      <w:r>
+        <w:rPr>
+          <w:bCs/>
+          <w:b/>
+        </w:rPr>
+        <w:t xml:space="preserve">Leitura que deve prevalecer.</w:t>
+      </w:r>
+      <w:r>
+        <w:t xml:space="preserve"> </w:t>
+      </w:r>
+      <w:r>
+        <w:t xml:space="preserve">Entre (a) e (b), a escolha depende do conteúdo dos documentos ausentes. Nenhuma das duas pode ser adotada com segurança antes de D1. Em qualquer hipótese, deixar de seguir o Relatório Final exige motivação expressa (art. 50, VII, da Lei nº 9.784/1999). A questão, incluída a questão prévia, deverá ser submetida à CONJUR.</w:t>
+      </w:r>
+      <w:r>
+        <w:t xml:space="preserve"> </w:t>
+      </w:r>
+      <w:r>
+        <w:t xml:space="preserve">-</w:t>
+      </w:r>
+      <w:r>
+        <w:t xml:space="preserve"> </w:t>
+      </w:r>
+      <w:r>
+        <w:rPr>
+          <w:iCs/>
+          <w:i/>
+        </w:rPr>
         <w:t xml:space="preserve">Conclusão parcial:</w:t>
       </w:r>
       <w:r>
@@ -7515,7 +8689,7 @@
         <w:t xml:space="preserve"> </w:t>
       </w:r>
       <w:r>
-        <w:t xml:space="preserve">(CF, art. 5º, LXXVIII; Lei nº 9.784/1999, arts. 2º, parágrafo único, IX, e 49), e não a presunção de cumprimento.</w:t>
+        <w:t xml:space="preserve">(CF, art. 5º, LXXVIII; Lei nº 9.784/1999, art. 2º, caput — eficiência —, e art. 49), e não a presunção de cumprimento.</w:t>
       </w:r>
       <w:r>
         <w:t xml:space="preserve"> </w:t>
@@ -7721,19 +8895,19 @@
               <w:jc w:val="left"/>
             </w:pPr>
             <w:r>
-              <w:t xml:space="preserve">j. 29/09/2017 (dado de fonte secundária)</w:t>
-            </w:r>
-          </w:p>
-        </w:tc>
-        <w:tc>
-          <w:tcPr/>
-          <w:p>
-            <w:pPr>
-              <w:pStyle w:val="Compact"/>
-              <w:jc w:val="left"/>
-            </w:pPr>
-            <w:r>
-              <w:t xml:space="preserve">Lei 8.666/93, art. 87, IV</w:t>
+              <w:t xml:space="preserve">Sessão virtual de 22 a 28/09/2017; DJe de 09/10/2017 (fonte secundária)</w:t>
+            </w:r>
+          </w:p>
+        </w:tc>
+        <w:tc>
+          <w:tcPr/>
+          <w:p>
+            <w:pPr>
+              <w:pStyle w:val="Compact"/>
+              <w:jc w:val="left"/>
+            </w:pPr>
+            <w:r>
+              <w:t xml:space="preserve">Lei 8.666/93, art. 87, IV; CF, art. 5º, XLVI e XLVII</w:t>
             </w:r>
           </w:p>
         </w:tc>
@@ -7784,7 +8958,7 @@
               <w:t xml:space="preserve">”</w:t>
             </w:r>
             <w:r>
-              <w:t xml:space="preserve">. Distinção: lá não havia apuração do dano; aqui houve apontamento pela CPAR, de alcance a verificar</w:t>
+              <w:t xml:space="preserve">. Distinção: lá não havia procedimento de apuração do dano; aqui houve apontamento pela CPAR, de alcance a verificar</w:t>
             </w:r>
           </w:p>
         </w:tc>
@@ -8211,7 +9385,141 @@
         <w:t xml:space="preserve">Produto 5</w:t>
       </w:r>
       <w:r>
-        <w:t xml:space="preserve">. São elas: D1 (documentos internos do PAR), D2 (Petrobras), D3 (AGU), D4 (TCU), D5 (SFC/CGU), D6 (juízo criminal: confisco e trânsito em julgado) e D7 (complementação pela DECAL).</w:t>
+        <w:t xml:space="preserve">. São elas: D1 (documentos internos do PAR), D2 (Petrobras), D3 (AGU), D3-A (MPF), D4 (TCU), D5 (SFC/CGU), D6 (juízo criminal: confisco e trânsito em julgado), D7 (complementação pela DECAL) e D8 (vista ao interessado).</w:t>
+      </w:r>
+    </w:p>
+    <w:p>
+      <w:pPr>
+        <w:pStyle w:val="BodyText"/>
+      </w:pPr>
+      <w:r>
+        <w:t xml:space="preserve">10.3.</w:t>
+      </w:r>
+      <w:r>
+        <w:t xml:space="preserve"> </w:t>
+      </w:r>
+      <w:r>
+        <w:rPr>
+          <w:bCs/>
+          <w:b/>
+        </w:rPr>
+        <w:t xml:space="preserve">Indispensabilidade.</w:t>
+      </w:r>
+      <w:r>
+        <w:t xml:space="preserve"> </w:t>
+      </w:r>
+      <w:r>
+        <w:t xml:space="preserve">- D1 é</w:t>
+      </w:r>
+      <w:r>
+        <w:t xml:space="preserve"> </w:t>
+      </w:r>
+      <w:r>
+        <w:rPr>
+          <w:bCs/>
+          <w:b/>
+        </w:rPr>
+        <w:t xml:space="preserve">indispensável</w:t>
+      </w:r>
+      <w:r>
+        <w:t xml:space="preserve">: trata do próprio</w:t>
+      </w:r>
+      <w:r>
+        <w:t xml:space="preserve"> </w:t>
+      </w:r>
+      <w:r>
+        <w:t xml:space="preserve">“</w:t>
+      </w:r>
+      <w:r>
+        <w:t xml:space="preserve">apontamento</w:t>
+      </w:r>
+      <w:r>
+        <w:t xml:space="preserve">”</w:t>
+      </w:r>
+      <w:r>
+        <w:t xml:space="preserve"> </w:t>
+      </w:r>
+      <w:r>
+        <w:t xml:space="preserve">a que alude a norma.</w:t>
+      </w:r>
+      <w:r>
+        <w:t xml:space="preserve"> </w:t>
+      </w:r>
+      <w:r>
+        <w:t xml:space="preserve">- D2 é</w:t>
+      </w:r>
+      <w:r>
+        <w:t xml:space="preserve"> </w:t>
+      </w:r>
+      <w:r>
+        <w:rPr>
+          <w:bCs/>
+          <w:b/>
+        </w:rPr>
+        <w:t xml:space="preserve">indispensável</w:t>
+      </w:r>
+      <w:r>
+        <w:t xml:space="preserve">: a Petrobras é a titular do eventual crédito, e a CGU não pode declarar sua inexistência ou quitação sem ouvi-la.</w:t>
+      </w:r>
+      <w:r>
+        <w:t xml:space="preserve"> </w:t>
+      </w:r>
+      <w:r>
+        <w:t xml:space="preserve">- D8 é</w:t>
+      </w:r>
+      <w:r>
+        <w:t xml:space="preserve"> </w:t>
+      </w:r>
+      <w:r>
+        <w:rPr>
+          <w:bCs/>
+          <w:b/>
+        </w:rPr>
+        <w:t xml:space="preserve">indispensável</w:t>
+      </w:r>
+      <w:r>
+        <w:t xml:space="preserve"> </w:t>
+      </w:r>
+      <w:r>
+        <w:t xml:space="preserve">se as diligências trouxerem elementos desfavoráveis.</w:t>
+      </w:r>
+      <w:r>
+        <w:t xml:space="preserve"> </w:t>
+      </w:r>
+      <w:r>
+        <w:t xml:space="preserve">- D3, D3-A, D4 e D5 são</w:t>
+      </w:r>
+      <w:r>
+        <w:t xml:space="preserve"> </w:t>
+      </w:r>
+      <w:r>
+        <w:rPr>
+          <w:bCs/>
+          <w:b/>
+        </w:rPr>
+        <w:t xml:space="preserve">recomendáveis</w:t>
+      </w:r>
+      <w:r>
+        <w:t xml:space="preserve">, conforme a prática do precedente.</w:t>
+      </w:r>
+      <w:r>
+        <w:t xml:space="preserve"> </w:t>
+      </w:r>
+      <w:r>
+        <w:t xml:space="preserve">- D6 e D7 são</w:t>
+      </w:r>
+      <w:r>
+        <w:t xml:space="preserve"> </w:t>
+      </w:r>
+      <w:r>
+        <w:rPr>
+          <w:bCs/>
+          <w:b/>
+        </w:rPr>
+        <w:t xml:space="preserve">complementares</w:t>
+      </w:r>
+      <w:r>
+        <w:t xml:space="preserve">.</w:t>
       </w:r>
     </w:p>
     <w:bookmarkEnd w:id="34"/>
@@ -9123,7 +10431,7 @@
         <w:t xml:space="preserve"> </w:t>
       </w:r>
       <w:r>
-        <w:t xml:space="preserve">- (b) o ente potencialmente lesado (Petrobras) e os órgãos competentes (AGU, TCU, SFC/CGU) não foram consultados sobre prejuízos identificados ou quantificados;</w:t>
+        <w:t xml:space="preserve">- (b) o ente potencialmente lesado (Petrobras) e os órgãos competentes (AGU, MPF, TCU, SFC/CGU) não foram consultados sobre prejuízos identificados ou quantificados;</w:t>
       </w:r>
       <w:r>
         <w:t xml:space="preserve"> </w:t>
@@ -9205,7 +10513,13 @@
           <w:bCs/>
           <w:b/>
         </w:rPr>
-        <w:t xml:space="preserve">Prognóstico condicionado:</w:t>
+        <w:t xml:space="preserve">Prognóstico condicionado</w:t>
+      </w:r>
+      <w:r>
+        <w:t xml:space="preserve"> </w:t>
+      </w:r>
+      <w:r>
+        <w:t xml:space="preserve">(sempre após vista ao interessado — art. 44 da Lei nº 9.784/1999):</w:t>
       </w:r>
       <w:r>
         <w:t xml:space="preserve"> </w:t>
@@ -9227,20 +10541,36 @@
         <w:t xml:space="preserve"> </w:t>
       </w:r>
       <w:r>
-        <w:t xml:space="preserve">As diligências D1 a D6 não revelam prejuízo apontado em decisão definitiva e exigível, ou revelam apontamento sem adoção pela decisão sancionadora. O requisito deverá ser considerado</w:t>
-      </w:r>
-      <w:r>
-        <w:t xml:space="preserve"> </w:t>
-      </w:r>
-      <w:r>
-        <w:rPr>
-          <w:bCs/>
-          <w:b/>
-        </w:rPr>
-        <w:t xml:space="preserve">atendido por inexistência de prejuízo apontado a ressarcir</w:t>
-      </w:r>
-      <w:r>
-        <w:t xml:space="preserve">, na linha da NT nº 676/2026/SIPRI. Deve-se consignar que isso não equivale a reconhecer a inexistência de prejuízo e não impede apurações futuras.</w:t>
+        <w:t xml:space="preserve">As diligências D1 a D6 não revelam prejuízo identificado e quantificado em decisão administrativa ou judicial definitiva, com nexo causal (Seção 5.2-A, camada ii). Também se enquadra aqui o caso em que revelem apontamento não adotado pela decisão sancionadora, ou adotado apenas como estimativa por</w:t>
+      </w:r>
+      <w:r>
+        <w:t xml:space="preserve"> </w:t>
+      </w:r>
+      <w:r>
+        <w:rPr>
+          <w:iCs/>
+          <w:i/>
+        </w:rPr>
+        <w:t xml:space="preserve">proxy</w:t>
+      </w:r>
+      <w:r>
+        <w:t xml:space="preserve"> </w:t>
+      </w:r>
+      <w:r>
+        <w:t xml:space="preserve">cuja premissa foi infirmada judicialmente. O requisito deverá ser considerado</w:t>
+      </w:r>
+      <w:r>
+        <w:t xml:space="preserve"> </w:t>
+      </w:r>
+      <w:r>
+        <w:rPr>
+          <w:bCs/>
+          <w:b/>
+        </w:rPr>
+        <w:t xml:space="preserve">atendido (superado) por inexistência de prejuízo exigível a ressarcir</w:t>
+      </w:r>
+      <w:r>
+        <w:t xml:space="preserve">, na linha da NT nº 676/2026/SIPRI. Deve-se consignar que isso não equivale a reconhecer a inexistência de prejuízo e não impede apurações e cobranças futuras.</w:t>
       </w:r>
       <w:r>
         <w:t xml:space="preserve"> </w:t>
@@ -9262,7 +10592,7 @@
         <w:t xml:space="preserve"> </w:t>
       </w:r>
       <w:r>
-        <w:t xml:space="preserve">A Decisão nº 9 adotou o dano de USD 868.450,00 como prejuízo apontado. A CONJUR deverá se manifestar sobre sua subsistência diante do acórdão do TRF4, que é anterior ao apontamento. Mantido o apontamento, o requisito</w:t>
+        <w:t xml:space="preserve">A Decisão nº 9 adotou o dano de USD 868.450,00 com identificação, quantificação e nexo causal. A CONJUR deverá se manifestar sobre (i) sua aptidão para caracterizar prejuízo definitivamente constituído, considerando o art. 13 da Lei nº 12.846/2013 (questão prévia do item 9.4), e (ii) sua subsistência diante do acórdão do TRF4, anterior ao apontamento. Superadas ambas as questões em desfavor da requerente, o requisito</w:t>
       </w:r>
       <w:r>
         <w:t xml:space="preserve"> </w:t>
@@ -9278,7 +10608,7 @@
         <w:t xml:space="preserve"> </w:t>
       </w:r>
       <w:r>
-        <w:t xml:space="preserve">até o pagamento do valor, atualizado segundo critério definido pela Administração e descontado o montante que a Petrobras comprovadamente já tiver recebido por meio do confisco (D6).</w:t>
+        <w:t xml:space="preserve">até o pagamento do valor, atualizado por critério a definir. A imputação de valores eventualmente recebidos pela Petrobras por meio do confisco penal depende de juízo jurídico específico (Seção 8.6).</w:t>
       </w:r>
       <w:r>
         <w:t xml:space="preserve"> </w:t>
@@ -9300,7 +10630,7 @@
         <w:t xml:space="preserve"> </w:t>
       </w:r>
       <w:r>
-        <w:t xml:space="preserve">A Petrobras, a AGU ou o TCU informam prejuízo definitivamente constituído, com nexo com o ato sancionado. O requisito</w:t>
+        <w:t xml:space="preserve">A Petrobras, a AGU, o MPF ou o TCU informam prejuízo definitivamente constituído contra a DECAL, com nexo com o ato sancionado. O requisito</w:t>
       </w:r>
       <w:r>
         <w:t xml:space="preserve"> </w:t>
@@ -9346,13 +10676,19 @@
         <w:t xml:space="preserve"> </w:t>
       </w:r>
       <w:r>
-        <w:t xml:space="preserve">- (b) expeça ofícios à Petrobras, à AGU, ao TCU e à SFC/CGU (D2 a D5) e obtenha informações sobre o confisco e o trânsito em julgado da ação penal (D6), fixando prazo compatível com a celeridade exigida;</w:t>
-      </w:r>
-      <w:r>
-        <w:t xml:space="preserve"> </w:t>
-      </w:r>
-      <w:r>
-        <w:t xml:space="preserve">- (c) intime a DECAL para complementação documental (D7), observado o prazo que ela própria requereu [D11, § 45].</w:t>
+        <w:t xml:space="preserve">- (b) expeça ofícios à Petrobras, à AGU, ao MPF, ao TCU e à SFC/CGU (D2 a D5) e obtenha informações sobre o confisco e o trânsito em julgado da ação penal (D6), fixando prazo compatível com a celeridade exigida;</w:t>
+      </w:r>
+      <w:r>
+        <w:t xml:space="preserve"> </w:t>
+      </w:r>
+      <w:r>
+        <w:t xml:space="preserve">- (c) intime a DECAL para complementação documental (D7), observado o prazo que ela própria requereu [D11, § 45];</w:t>
+      </w:r>
+      <w:r>
+        <w:t xml:space="preserve"> </w:t>
+      </w:r>
+      <w:r>
+        <w:t xml:space="preserve">- (d) concluída a instrução, dê vista à DECAL dos elementos novos, para manifestação (D8; Lei nº 9.784/1999, arts. 3º, III, e 44).</w:t>
       </w:r>
     </w:p>
     <w:p>
@@ -9360,7 +10696,25 @@
         <w:pStyle w:val="BodyText"/>
       </w:pPr>
       <w:r>
-        <w:t xml:space="preserve">12.2. Recebidas as respostas, deve ser elaborada análise técnica conclusiva sobre o inciso II (art. 5º), em conjunto com os demais requisitos examinados pelas unidades competentes, e os autos devem ser remetidos à CONJUR/CGU (art. 6º). Recomenda-se submeter expressamente à CONJUR a questão do item 9.4 (subsistência do apontamento de dano diante do acórdão do TRF4).</w:t>
+        <w:t xml:space="preserve">12.2. Recebidas as respostas e a manifestação do interessado, deve ser elaborada análise técnica conclusiva sobre o inciso II (art. 5º), em conjunto com os demais requisitos examinados pelas unidades competentes, e os autos devem ser remetidos à CONJUR/CGU (art. 6º). Recomenda-se submeter expressamente à CONJUR três questões:</w:t>
+      </w:r>
+      <w:r>
+        <w:t xml:space="preserve"> </w:t>
+      </w:r>
+      <w:r>
+        <w:t xml:space="preserve">- (i) a interpretação aplicável ao § 1º do art. 2º (item 6.3);</w:t>
+      </w:r>
+      <w:r>
+        <w:t xml:space="preserve"> </w:t>
+      </w:r>
+      <w:r>
+        <w:t xml:space="preserve">- (ii) a aptidão e a subsistência do apontamento de dano diante do art. 13 da Lei nº 12.846/2013 e do acórdão do TRF4 (item 9.4);</w:t>
+      </w:r>
+      <w:r>
+        <w:t xml:space="preserve"> </w:t>
+      </w:r>
+      <w:r>
+        <w:t xml:space="preserve">- (iii) a eventual imputação dos valores do confisco penal (item 8.6).</w:t>
       </w:r>
     </w:p>
     <w:p>
@@ -9668,7 +11022,7 @@
               <w:jc w:val="left"/>
             </w:pPr>
             <w:r>
-              <w:t xml:space="preserve">A Petrobras identificou ou quantificou prejuízo decorrente dos fatos (propina a PRC; contratos de 2006 a 2012 e de 2012)? Há cobrança, ação ou crédito contra a DECAL? Recebeu valores do confisco?</w:t>
+              <w:t xml:space="preserve">A Petrobras identificou ou quantificou prejuízo decorrente dos fatos (propina a PRC; contratos de 2006 a 2012 e de 2012)? Instaurou procedimento próprio em 2020, antes da avocação pela CGU, com apuração de dano? Há cobrança, ação ou crédito contra a DECAL? Recebeu valores do confisco?</w:t>
             </w:r>
           </w:p>
         </w:tc>
@@ -9692,7 +11046,7 @@
               <w:jc w:val="left"/>
             </w:pPr>
             <w:r>
-              <w:t xml:space="preserve">Manifestação formal das áreas jurídica, de auditoria interna e de contratos, com memória de cálculo ou declaração de inexistência</w:t>
+              <w:t xml:space="preserve">Manifestação formal das áreas jurídica, de auditoria interna e de contratos, com memória de cálculo ou declaração de inexistência; cópia de eventual apuração interna</w:t>
             </w:r>
           </w:p>
         </w:tc>
@@ -9728,7 +11082,17 @@
               <w:jc w:val="left"/>
             </w:pPr>
             <w:r>
-              <w:t xml:space="preserve">Pode levar ao Cenário 3 ou confirmar o Cenário 1</w:t>
+              <w:t xml:space="preserve">Pode levar ao Cenário 3 ou confirmar o Cenário 1.</w:t>
+            </w:r>
+            <w:r>
+              <w:t xml:space="preserve"> </w:t>
+            </w:r>
+            <w:r>
+              <w:rPr>
+                <w:bCs/>
+                <w:b/>
+              </w:rPr>
+              <w:t xml:space="preserve">Indispensável</w:t>
             </w:r>
           </w:p>
         </w:tc>
@@ -9758,7 +11122,7 @@
               <w:jc w:val="left"/>
             </w:pPr>
             <w:r>
-              <w:t xml:space="preserve">Há ações judiciais (ressarcimento, improbidade, art. 19 da Lei 12.846/13) que tenham identificado e mensurado definitivamente prejuízo? Qual o estado da ação anulatória e se nela se discute dano?</w:t>
+              <w:t xml:space="preserve">Há ações judiciais da União (ressarcimento, improbidade, art. 19 da Lei 12.846/13) que tenham identificado e mensurado definitivamente prejuízo? Qual o estado da ação anulatória e se nela se discute dano?</w:t>
             </w:r>
           </w:p>
         </w:tc>
@@ -9807,6 +11171,96 @@
             </w:pPr>
             <w:r>
               <w:t xml:space="preserve">Universo e definitividade</w:t>
+            </w:r>
+          </w:p>
+        </w:tc>
+        <w:tc>
+          <w:tcPr/>
+          <w:p>
+            <w:pPr>
+              <w:pStyle w:val="Compact"/>
+              <w:jc w:val="left"/>
+            </w:pPr>
+            <w:r>
+              <w:t xml:space="preserve">Idem</w:t>
+            </w:r>
+          </w:p>
+        </w:tc>
+      </w:tr>
+      <w:tr>
+        <w:tc>
+          <w:tcPr/>
+          <w:p>
+            <w:pPr>
+              <w:pStyle w:val="Compact"/>
+              <w:jc w:val="left"/>
+            </w:pPr>
+            <w:r>
+              <w:rPr>
+                <w:bCs/>
+                <w:b/>
+              </w:rPr>
+              <w:t xml:space="preserve">D3-A</w:t>
+            </w:r>
+          </w:p>
+        </w:tc>
+        <w:tc>
+          <w:tcPr/>
+          <w:p>
+            <w:pPr>
+              <w:pStyle w:val="Compact"/>
+              <w:jc w:val="left"/>
+            </w:pPr>
+            <w:r>
+              <w:t xml:space="preserve">O MPF, também legitimado para ações de improbidade e da Lei 12.846/13 (art. 19), ajuizou ação civil contra a DECAL pelos mesmos fatos?</w:t>
+            </w:r>
+          </w:p>
+        </w:tc>
+        <w:tc>
+          <w:tcPr/>
+          <w:p>
+            <w:pPr>
+              <w:pStyle w:val="Compact"/>
+              <w:jc w:val="left"/>
+            </w:pPr>
+            <w:r>
+              <w:t xml:space="preserve">Portaria 1.214, art. 4º, § 2º</w:t>
+            </w:r>
+          </w:p>
+        </w:tc>
+        <w:tc>
+          <w:tcPr/>
+          <w:p>
+            <w:pPr>
+              <w:pStyle w:val="Compact"/>
+              <w:jc w:val="left"/>
+            </w:pPr>
+            <w:r>
+              <w:t xml:space="preserve">Informação formal</w:t>
+            </w:r>
+          </w:p>
+        </w:tc>
+        <w:tc>
+          <w:tcPr/>
+          <w:p>
+            <w:pPr>
+              <w:pStyle w:val="Compact"/>
+              <w:jc w:val="left"/>
+            </w:pPr>
+            <w:r>
+              <w:t xml:space="preserve">MPF (PR/PR e PRR4)</w:t>
+            </w:r>
+          </w:p>
+        </w:tc>
+        <w:tc>
+          <w:tcPr/>
+          <w:p>
+            <w:pPr>
+              <w:pStyle w:val="Compact"/>
+              <w:jc w:val="left"/>
+            </w:pPr>
+            <w:r>
+              <w:t xml:space="preserve">Universo</w:t>
             </w:r>
           </w:p>
         </w:tc>
@@ -10160,7 +11614,7 @@
               <w:t xml:space="preserve"> </w:t>
             </w:r>
             <w:r>
-              <w:t xml:space="preserve">(DFs 2025, nota 17.d); declaração sobre processos de ressarcimento em curso relativos aos fatos; peças principais da ação anulatória</w:t>
+              <w:t xml:space="preserve">(DFs 2025, nota 17.d); certidões de distribuição de ações cíveis (Justiça Federal e Estadual) em seu nome; declaração sobre processos de ressarcimento em curso relativos aos fatos; peças principais da ação anulatória</w:t>
             </w:r>
           </w:p>
         </w:tc>
@@ -10197,6 +11651,96 @@
             </w:pPr>
             <w:r>
               <w:t xml:space="preserve">Complementar</w:t>
+            </w:r>
+          </w:p>
+        </w:tc>
+      </w:tr>
+      <w:tr>
+        <w:tc>
+          <w:tcPr/>
+          <w:p>
+            <w:pPr>
+              <w:pStyle w:val="Compact"/>
+              <w:jc w:val="left"/>
+            </w:pPr>
+            <w:r>
+              <w:rPr>
+                <w:bCs/>
+                <w:b/>
+              </w:rPr>
+              <w:t xml:space="preserve">D8</w:t>
+            </w:r>
+          </w:p>
+        </w:tc>
+        <w:tc>
+          <w:tcPr/>
+          <w:p>
+            <w:pPr>
+              <w:pStyle w:val="Compact"/>
+              <w:jc w:val="left"/>
+            </w:pPr>
+            <w:r>
+              <w:t xml:space="preserve">Manifestação do interessado sobre os elementos obtidos nas diligências</w:t>
+            </w:r>
+          </w:p>
+        </w:tc>
+        <w:tc>
+          <w:tcPr/>
+          <w:p>
+            <w:pPr>
+              <w:pStyle w:val="Compact"/>
+              <w:jc w:val="left"/>
+            </w:pPr>
+            <w:r>
+              <w:t xml:space="preserve">CF, art. 5º, LV; Lei 9.784/99, arts. 3º, III, e 44</w:t>
+            </w:r>
+          </w:p>
+        </w:tc>
+        <w:tc>
+          <w:tcPr/>
+          <w:p>
+            <w:pPr>
+              <w:pStyle w:val="Compact"/>
+              <w:jc w:val="left"/>
+            </w:pPr>
+            <w:r>
+              <w:t xml:space="preserve">Vista dos autos e prazo para manifestação</w:t>
+            </w:r>
+          </w:p>
+        </w:tc>
+        <w:tc>
+          <w:tcPr/>
+          <w:p>
+            <w:pPr>
+              <w:pStyle w:val="Compact"/>
+              <w:jc w:val="left"/>
+            </w:pPr>
+            <w:r>
+              <w:t xml:space="preserve">DECAL</w:t>
+            </w:r>
+          </w:p>
+        </w:tc>
+        <w:tc>
+          <w:tcPr/>
+          <w:p>
+            <w:pPr>
+              <w:pStyle w:val="Compact"/>
+              <w:jc w:val="left"/>
+            </w:pPr>
+            <w:r>
+              <w:t xml:space="preserve">Contraditório</w:t>
+            </w:r>
+          </w:p>
+        </w:tc>
+        <w:tc>
+          <w:tcPr/>
+          <w:p>
+            <w:pPr>
+              <w:pStyle w:val="Compact"/>
+              <w:jc w:val="left"/>
+            </w:pPr>
+            <w:r>
+              <w:t xml:space="preserve">Indispensável antes de conclusão desfavorável</w:t>
             </w:r>
           </w:p>
         </w:tc>
@@ -10310,7 +11854,7 @@
         <w:t xml:space="preserve"> </w:t>
       </w:r>
       <w:r>
-        <w:t xml:space="preserve">- [ ] Textos oficiais da PN 226/2025, do Decreto 11.129/2022 e do inteiro teor do RMS 33.526 conferidos na fonte primária (</w:t>
+        <w:t xml:space="preserve">- [ ] Textos oficiais conferidos na fonte primária: PN 226/2025, redação consolidada da Portaria 1.214 após a PN 54/2023, Leis 8.666/93, 12.846/13 e 9.784/99, códigos e inteiro teor do RMS 33.526 (</w:t>
       </w:r>
       <w:r>
         <w:rPr>
@@ -10320,7 +11864,37 @@
         <w:t xml:space="preserve">pendente</w:t>
       </w:r>
       <w:r>
-        <w:t xml:space="preserve">; Anexo C).</w:t>
+        <w:t xml:space="preserve">; quadro 6.5-A e Anexo C).</w:t>
+      </w:r>
+      <w:r>
+        <w:t xml:space="preserve"> </w:t>
+      </w:r>
+      <w:r>
+        <w:t xml:space="preserve">- [x] Duas interpretações sobre o § 1º do art. 2º (IN 2/2018 x PNI 1/2025) apresentadas e escolha justificada (item 6.3).</w:t>
+      </w:r>
+      <w:r>
+        <w:t xml:space="preserve"> </w:t>
+      </w:r>
+      <w:r>
+        <w:t xml:space="preserve">- [x] Distinção entre prejuízo</w:t>
+      </w:r>
+      <w:r>
+        <w:t xml:space="preserve"> </w:t>
+      </w:r>
+      <w:r>
+        <w:t xml:space="preserve">“</w:t>
+      </w:r>
+      <w:r>
+        <w:t xml:space="preserve">apontado</w:t>
+      </w:r>
+      <w:r>
+        <w:t xml:space="preserve">”</w:t>
+      </w:r>
+      <w:r>
+        <w:t xml:space="preserve"> </w:t>
+      </w:r>
+      <w:r>
+        <w:t xml:space="preserve">e prejuízo exigível (item 5.2-A); questão do art. 13 da Lei 12.846/13 enfrentada (item 9.4).</w:t>
       </w:r>
     </w:p>
     <w:p>
@@ -10431,7 +12005,19 @@
         <w:t xml:space="preserve"> </w:t>
       </w:r>
       <w:r>
-        <w:t xml:space="preserve">- [x] Encaminhamento à CONJUR (art. 6º) preservado; questão do item 9.4 destacada.</w:t>
+        <w:t xml:space="preserve">- [x] Encaminhamento à CONJUR (art. 6º) preservado; questões dos itens 6.3, 8.6 e 9.4 destacadas.</w:t>
+      </w:r>
+      <w:r>
+        <w:t xml:space="preserve"> </w:t>
+      </w:r>
+      <w:r>
+        <w:t xml:space="preserve">- [x] Contraditório sobre o resultado das diligências assegurado (D8; art. 44 da Lei 9.784/99).</w:t>
+      </w:r>
+      <w:r>
+        <w:t xml:space="preserve"> </w:t>
+      </w:r>
+      <w:r>
+        <w:t xml:space="preserve">- [x] MPF incluído entre os órgãos consultados (D3-A).</w:t>
       </w:r>
     </w:p>
     <w:p>
@@ -14523,7 +16109,7 @@
       </w:r>
     </w:p>
     <w:bookmarkEnd w:id="41"/>
-    <w:bookmarkStart w:id="49" w:name="anexo-c-limitações-de-acesso-e-fontes"/>
+    <w:bookmarkStart w:id="53" w:name="anexo-c-limitações-de-acesso-e-fontes"/>
     <w:p>
       <w:pPr>
         <w:pStyle w:val="Heading1"/>
@@ -14648,7 +16234,7 @@
         <w:pStyle w:val="Compact"/>
       </w:pPr>
       <w:r>
-        <w:t xml:space="preserve">quanto ao RMS nº 33.526/DF, foram verificados por fonte secundária apenas a existência do agravo regimental julgado pela 2ª Turma em 29/09/2017 e sua ementa geral. O trecho da decisão monocrática é o transcrito pela DECAL.</w:t>
+        <w:t xml:space="preserve">quanto ao RMS nº 33.526/DF, foram verificados por fonte secundária apenas a existência do agravo regimental da União, desprovido por unanimidade pela 2ª Turma em sessão virtual de 22 a 28/09/2017 (DJe de 09/10/2017), e os temas gerais da ementa. O trecho da decisão monocrática é o transcrito pela DECAL. (A versão 1 desta Nota indicava, de forma imprecisa, julgamento em 29/09/2017.)</w:t>
       </w:r>
     </w:p>
     <w:p>
@@ -14660,23 +16246,20 @@
         <w:pStyle w:val="Compact"/>
       </w:pPr>
       <w:r>
-        <w:t xml:space="preserve">Notas técnicas de reabilitação da CGU localizadas no repositório institucional (casos IESA e Mendes Júnior)</w:t>
-      </w:r>
-      <w:r>
-        <w:t xml:space="preserve"> </w:t>
-      </w:r>
-      <w:r>
-        <w:rPr>
-          <w:bCs/>
-          <w:b/>
-        </w:rPr>
-        <w:t xml:space="preserve">não puderam ser lidas</w:t>
-      </w:r>
-      <w:r>
-        <w:t xml:space="preserve"> </w:t>
-      </w:r>
-      <w:r>
-        <w:t xml:space="preserve">e não foram utilizadas.</w:t>
+        <w:t xml:space="preserve">Notas técnicas de reabilitação da CGU localizadas no repositório institucional (casos IESA e Mendes Júnior) e o Parecer nº 00241/2023/CONJUR-CGU/CGU/AGU</w:t>
+      </w:r>
+      <w:r>
+        <w:t xml:space="preserve"> </w:t>
+      </w:r>
+      <w:r>
+        <w:rPr>
+          <w:bCs/>
+          <w:b/>
+        </w:rPr>
+        <w:t xml:space="preserve">não puderam ser lidos</w:t>
+      </w:r>
+      <w:r>
+        <w:t xml:space="preserve">. Do parecer utilizou-se apenas a síntese secundária indicada no item 9.1, como reforço, não como fundamento.</w:t>
       </w:r>
     </w:p>
     <w:p>
@@ -14806,11 +16389,79 @@
           <w:rPr>
             <w:rStyle w:val="Hyperlink"/>
           </w:rPr>
+          <w:t xml:space="preserve">Repositório CGU — PN 54/2023 (retificada)</w:t>
+        </w:r>
+      </w:hyperlink>
+    </w:p>
+    <w:p>
+      <w:pPr>
+        <w:numPr>
+          <w:ilvl w:val="1"/>
+          <w:numId w:val="1009"/>
+        </w:numPr>
+        <w:pStyle w:val="Compact"/>
+      </w:pPr>
+      <w:hyperlink r:id="rId49">
+        <w:r>
+          <w:rPr>
+            <w:rStyle w:val="Hyperlink"/>
+          </w:rPr>
+          <w:t xml:space="preserve">ANTTlegis — Portaria 1.214/2020 consolidada</w:t>
+        </w:r>
+      </w:hyperlink>
+    </w:p>
+    <w:p>
+      <w:pPr>
+        <w:numPr>
+          <w:ilvl w:val="1"/>
+          <w:numId w:val="1009"/>
+        </w:numPr>
+        <w:pStyle w:val="Compact"/>
+      </w:pPr>
+      <w:hyperlink r:id="rId50">
+        <w:r>
+          <w:rPr>
+            <w:rStyle w:val="Hyperlink"/>
+          </w:rPr>
+          <w:t xml:space="preserve">Base de Conhecimento CGU — NT 676/2026/SIPRI (publicação oficial do precedente D15)</w:t>
+        </w:r>
+      </w:hyperlink>
+    </w:p>
+    <w:p>
+      <w:pPr>
+        <w:numPr>
+          <w:ilvl w:val="1"/>
+          <w:numId w:val="1009"/>
+        </w:numPr>
+        <w:pStyle w:val="Compact"/>
+      </w:pPr>
+      <w:hyperlink r:id="rId51">
+        <w:r>
+          <w:rPr>
+            <w:rStyle w:val="Hyperlink"/>
+          </w:rPr>
+          <w:t xml:space="preserve">Repositório CGU — Parecer 00241/2023/CONJUR (Mendes Júnior)</w:t>
+        </w:r>
+      </w:hyperlink>
+    </w:p>
+    <w:p>
+      <w:pPr>
+        <w:numPr>
+          <w:ilvl w:val="1"/>
+          <w:numId w:val="1009"/>
+        </w:numPr>
+        <w:pStyle w:val="Compact"/>
+      </w:pPr>
+      <w:hyperlink r:id="rId52">
+        <w:r>
+          <w:rPr>
+            <w:rStyle w:val="Hyperlink"/>
+          </w:rPr>
           <w:t xml:space="preserve">Juruá — Lei 14.133, art. 163</w:t>
         </w:r>
       </w:hyperlink>
     </w:p>
-    <w:bookmarkEnd w:id="49"/>
+    <w:bookmarkEnd w:id="53"/>
     <w:sectPr/>
   </w:body>
 </w:document>

</xml_diff>